<commit_message>
Add AAAAI-2025 long-term durability abstract; update SRL to v0.2
- Register AAAAI-2025-061 (Magerl et al.): open-label longer-term
  follow-up of all n=28 lonvo-z 50 mg patients, up to ~2 years. Only
  the lonvo-z abstract (061) from the shared JACI supplement page is
  extracted and cited; competitor abstracts on the same page (e.g.
  donidalorsen) are deliberately excluded to prevent non-compliant
  cross-trial comparison. Scope note added to index and README.
- Update SRL-2026-0001 to v0.2: incorporate the ~2-year durability
  data (median 18.9 mo follow-up; 95% mean attack-rate reduction;
  93% (26/28) attack-free and prophylaxis-free) into the durability
  answer, labeled as single-arm open-label congress-abstract data;
  narrow the durability data-gap accordingly.

Co-Authored-By: Claude Opus 4.8 <noreply@anthropic.com>
Claude-Session: https://claude.ai/code/session_013RA9RR2HH6McCvzF5hNysT
</commit_message>
<xml_diff>
--- a/output/SRL_efficacy_cure-rate-durability_DRAFT.docx
+++ b/output/SRL_efficacy_cure-rate-durability_DRAFT.docx
@@ -56,7 +56,7 @@
         <w:t xml:space="preserve">     Version: </w:t>
       </w:r>
       <w:r>
-        <w:t xml:space="preserve">0.1 DRAFT</w:t>
+        <w:t xml:space="preserve">0.2 DRAFT</w:t>
       </w:r>
     </w:p>
     <w:p>
@@ -240,6 +240,21 @@
     </w:p>
     <w:p>
       <w:pPr>
+        <w:spacing w:after="120"/>
+      </w:pPr>
+      <w:r>
+        <w:rPr>
+          <w:b/>
+          <w:bCs/>
+        </w:rPr>
+        <w:t xml:space="preserve">Longer-term, open-label follow-up (congress abstract). </w:t>
+      </w:r>
+      <w:r>
+        <w:t xml:space="preserve">In a longer-term analysis of all 28 patients who received lonvo-z 50 mg across the Phase 1/2 program (including patients who crossed over from placebo or 25 mg), 26 of 28 patients (93%) were attack-free and free of long-term prophylaxis at the latest follow-up, for a median of 10.2 months (range, 0.5 to 24.0); the mean reduction in monthly attack rate from baseline to the latest assessment was 95% without prophylaxis. These are single-arm, open-label data reported in a congress abstract (not a full peer-reviewed manuscript) and are not placebo-controlled. [4]</w:t>
+      </w:r>
+    </w:p>
+    <w:p>
+      <w:pPr>
         <w:pStyle w:val="Heading3"/>
         <w:spacing w:after="80" w:before="160"/>
       </w:pPr>
@@ -252,7 +267,7 @@
         <w:spacing w:after="120"/>
       </w:pPr>
       <w:r>
-        <w:t xml:space="preserve">The lonvo-z clinical data span three studies, with the following reported follow-up as of each study’s data-cutoff date:</w:t>
+        <w:t xml:space="preserve">The lonvo-z clinical data span the following studies, with the reported follow-up as of each study’s data-cutoff date:</w:t>
       </w:r>
     </w:p>
     <w:p>
@@ -312,15 +327,35 @@
         <w:t xml:space="preserve">Phase 1</w:t>
       </w:r>
       <w:r>
-        <w:t xml:space="preserve"> — as of the 17 February 2023 data cutoff, median follow-up was 13.1 months (25-mg group), 9.3 months (75-mg group), and 5.7 months (50-mg group) — the longest follow-up reported in the program to date. Across dose levels, the reductions in total plasma kallikrein levels and in angioedema attacks were durable through the latest assessment. [3]</w:t>
-      </w:r>
-    </w:p>
-    <w:p>
-      <w:pPr>
-        <w:spacing w:after="120"/>
-      </w:pPr>
-      <w:r>
-        <w:t xml:space="preserve">Longer-term and ongoing follow-up continue to accrue.</w:t>
+        <w:t xml:space="preserve"> — as of the 17 February 2023 data cutoff, median follow-up was 13.1 months (25-mg group), 9.3 months (75-mg group), and 5.7 months (50-mg group). Across dose levels, the reductions in total plasma kallikrein levels and in angioedema attacks were durable through the latest assessment. [3]</w:t>
+      </w:r>
+    </w:p>
+    <w:p>
+      <w:pPr>
+        <w:pStyle w:val="ListParagraph"/>
+        <w:numPr>
+          <w:ilvl w:val="0"/>
+          <w:numId w:val="1"/>
+        </w:numPr>
+        <w:spacing w:after="60"/>
+      </w:pPr>
+      <w:r>
+        <w:rPr>
+          <w:b/>
+          <w:bCs/>
+        </w:rPr>
+        <w:t xml:space="preserve">Longer-term 50-mg analysis (congress abstract)</w:t>
+      </w:r>
+      <w:r>
+        <w:t xml:space="preserve"> — in all 28 patients who received lonvo-z 50 mg across the Phase 1/2 program, as of the 12 February 2025 data cutoff, median follow-up after the 50-mg dose was 18.9 months (range, 10.2 to 24.4) in the cohort dosed initially at 50 mg — representing up to approximately 2 years of follow-up, the longest reported to date. This is a single-arm, open-label abstract analysis. [4]</w:t>
+      </w:r>
+    </w:p>
+    <w:p>
+      <w:pPr>
+        <w:spacing w:after="120"/>
+      </w:pPr>
+      <w:r>
+        <w:t xml:space="preserve">The available data therefore extend to approximately two years of follow-up for the earliest-treated 50-mg patients, with shorter follow-up for more recently treated patients; longer-term and ongoing follow-up continue to accrue.</w:t>
       </w:r>
     </w:p>
     <w:p>
@@ -339,7 +374,7 @@
         <w:t xml:space="preserve">Data gap identified: </w:t>
       </w:r>
       <w:r>
-        <w:t xml:space="preserve">The available lonvo-z source documents do not report durability of effect beyond the follow-up durations noted above. Requests for longer-term durability data are flagged for the Medical Information team for follow-up as additional data become available.</w:t>
+        <w:t xml:space="preserve">The available lonvo-z source documents report follow-up of up to approximately two years; durability beyond this period is not yet established. Requests for longer-term durability data are flagged for the Medical Information team for follow-up as additional data become available.</w:t>
       </w:r>
     </w:p>
     <w:p>
@@ -410,10 +445,18 @@
     </w:p>
     <w:p>
       <w:pPr>
-        <w:spacing w:after="120"/>
+        <w:spacing w:after="60"/>
       </w:pPr>
       <w:r>
         <w:t xml:space="preserve">3. Longhurst HJ, Lindsay K, Petersen RS, et al. CRISPR-Cas9 in vivo gene editing of KLKB1 for hereditary angioedema. N Engl J Med. 2024;390(5):432-441. DOI: 10.1056/NEJMoa2309149. (NCT05120830.)</w:t>
+      </w:r>
+    </w:p>
+    <w:p>
+      <w:pPr>
+        <w:spacing w:after="120"/>
+      </w:pPr>
+      <w:r>
+        <w:t xml:space="preserve">4. Magerl M, Gurugama P, Katelaris C, et al. Long-term durability and safety of lonvoguran ziclumeran (lonvo-z, NTLA-2002) 50 mg in patients with hereditary angioedema. J Allergy Clin Immunol. 2025;157(2):AB21. Abstract 061, AAAAI Annual Meeting 2025. (Congress abstract; open-label, single-arm follow-up.)</w:t>
       </w:r>
     </w:p>
     <w:p>
@@ -536,7 +579,7 @@
         <w:sz w:val="15"/>
         <w:szCs w:val="15"/>
       </w:rPr>
-      <w:t xml:space="preserve">SRL-2026-0001 · 0.1 DRAFT · </w:t>
+      <w:t xml:space="preserve">SRL-2026-0001 · 0.2 DRAFT · </w:t>
     </w:r>
     <w:r>
       <w:rPr>

</xml_diff>

<commit_message>
Adopt most-relevant-only house style; streamline SRL to v0.3
House-style change per MI review: answer the HCP's question with the
most relevant, highest-quality evidence rather than every data point.

- lonvo-z-srl skill: add Step 2.5 "Select for relevance" — prefer the
  pivotal Phase 3 (HAELO, 50 mg) for efficacy/safety; omit superseded
  dose-finding Phase 1/2 by default; use lower-tier/older data only
  where it is the most relevant source for the sub-question (e.g. the
  long-term durability abstract), with the evidence tier labeled;
  include Phase 1/2 only when the HCP explicitly asks. Omission for
  relevance is not a data gap.
- SRL-2026-0001 v0.3: remove Phase 1/2 dose-finding data; lead with
  HAELO attack-free/attack-rate results and the long-term 50 mg
  durability analysis; references trimmed to HAELO + AAAAI-2025-061.

Co-Authored-By: Claude Opus 4.8 <noreply@anthropic.com>
Claude-Session: https://claude.ai/code/session_013RA9RR2HH6McCvzF5hNysT
</commit_message>
<xml_diff>
--- a/output/SRL_efficacy_cure-rate-durability_DRAFT.docx
+++ b/output/SRL_efficacy_cure-rate-durability_DRAFT.docx
@@ -56,7 +56,7 @@
         <w:t xml:space="preserve">     Version: </w:t>
       </w:r>
       <w:r>
-        <w:t xml:space="preserve">0.2 DRAFT</w:t>
+        <w:t xml:space="preserve">0.3 DRAFT</w:t>
       </w:r>
     </w:p>
     <w:p>
@@ -185,7 +185,7 @@
         <w:t xml:space="preserve">"cure" is not an endpoint that has been evaluated or established in the lonvo-z clinical program.</w:t>
       </w:r>
       <w:r>
-        <w:t xml:space="preserve"> Accordingly, we are unable to characterize a "cure rate." The clinical trials have instead assessed the effect of a single dose of lonvo-z on hereditary angioedema attacks, including the proportion of patients who became </w:t>
+        <w:t xml:space="preserve"> We are therefore unable to characterize a "cure rate." The most relevant available measures are the proportion of patients who became </w:t>
       </w:r>
       <w:r>
         <w:rPr>
@@ -205,52 +205,37 @@
         <w:t xml:space="preserve">reduction in attack rate</w:t>
       </w:r>
       <w:r>
-        <w:t xml:space="preserve">. The most relevant data are summarized below.</w:t>
-      </w:r>
-    </w:p>
-    <w:p>
-      <w:pPr>
-        <w:spacing w:after="120"/>
-      </w:pPr>
-      <w:r>
-        <w:rPr>
-          <w:b/>
-          <w:bCs/>
-        </w:rPr>
-        <w:t xml:space="preserve">Attack-free status and attack-rate reduction — Phase 3 HAELO trial. </w:t>
-      </w:r>
-      <w:r>
-        <w:t xml:space="preserve">In the pivotal, double-blind Phase 3 HAELO trial (single intravenous dose of lonvo-z 50 mg [n=52] vs. placebo [n=28]), 32 of 52 patients (62%; 95% CI, 47 to 75) in the lonvo-z group were attack-free from Week 5 through Week 28, compared with 3 of 28 patients (11%; 95% CI, 2 to 28) in the placebo group (odds ratio, 12.81; 95% CI, 3.45 to 47.55; P&lt;0.001). Over the same period, the least-squares mean monthly attack rate was 0.26 (95% CI, 0.15 to 0.45) with lonvo-z versus 2.10 (95% CI, 1.55 to 2.86) with placebo — a relative reduction of 87% (95% CI, −93 to −78; P&lt;0.001). Through the last follow-up assessment, 60% (31 of 52) of lonvo-z–treated patients were attack-free without the use of long-term prophylaxis. [1]</w:t>
-      </w:r>
-    </w:p>
-    <w:p>
-      <w:pPr>
-        <w:spacing w:after="120"/>
-      </w:pPr>
-      <w:r>
-        <w:rPr>
-          <w:b/>
-          <w:bCs/>
-        </w:rPr>
-        <w:t xml:space="preserve">Attack-free status — Phase 2 trial. </w:t>
-      </w:r>
-      <w:r>
-        <w:t xml:space="preserve">In the randomized Phase 2 portion, 4 of 10 patients (40%) who received 25 mg and 8 of 11 patients (73%) who received 50 mg were attack-free with no additional treatment from Week 1 through Week 16. [2]</w:t>
-      </w:r>
-    </w:p>
-    <w:p>
-      <w:pPr>
-        <w:spacing w:after="120"/>
-      </w:pPr>
-      <w:r>
-        <w:rPr>
-          <w:b/>
-          <w:bCs/>
-        </w:rPr>
-        <w:t xml:space="preserve">Longer-term, open-label follow-up (congress abstract). </w:t>
-      </w:r>
-      <w:r>
-        <w:t xml:space="preserve">In a longer-term analysis of all 28 patients who received lonvo-z 50 mg across the Phase 1/2 program (including patients who crossed over from placebo or 25 mg), 26 of 28 patients (93%) were attack-free and free of long-term prophylaxis at the latest follow-up, for a median of 10.2 months (range, 0.5 to 24.0); the mean reduction in monthly attack rate from baseline to the latest assessment was 95% without prophylaxis. These are single-arm, open-label data reported in a congress abstract (not a full peer-reviewed manuscript) and are not placebo-controlled. [4]</w:t>
+        <w:t xml:space="preserve">, reported below from the pivotal Phase 3 trial together with longer-term follow-up.</w:t>
+      </w:r>
+    </w:p>
+    <w:p>
+      <w:pPr>
+        <w:spacing w:after="120"/>
+      </w:pPr>
+      <w:r>
+        <w:rPr>
+          <w:b/>
+          <w:bCs/>
+        </w:rPr>
+        <w:t xml:space="preserve">Phase 3 HAELO trial (pivotal, placebo-controlled). </w:t>
+      </w:r>
+      <w:r>
+        <w:t xml:space="preserve">In this double-blind trial, patients received a single intravenous dose of lonvo-z 50 mg (n=52) or placebo (n=28). From Week 5 through Week 28, 32 of 52 patients (62%; 95% CI, 47 to 75) in the lonvo-z group were attack-free, compared with 3 of 28 patients (11%; 95% CI, 2 to 28) in the placebo group (odds ratio, 12.81; 95% CI, 3.45 to 47.55; P&lt;0.001). The least-squares mean monthly attack rate over the same period was 0.26 (95% CI, 0.15 to 0.45) with lonvo-z versus 2.10 (95% CI, 1.55 to 2.86) with placebo — a relative reduction of 87% (95% CI, −93 to −78; P&lt;0.001). [1]</w:t>
+      </w:r>
+    </w:p>
+    <w:p>
+      <w:pPr>
+        <w:spacing w:after="120"/>
+      </w:pPr>
+      <w:r>
+        <w:rPr>
+          <w:b/>
+          <w:bCs/>
+        </w:rPr>
+        <w:t xml:space="preserve">Longer-term durability (open-label analysis). </w:t>
+      </w:r>
+      <w:r>
+        <w:t xml:space="preserve">Across all 28 patients who received lonvo-z 50 mg, 26 of 28 (93%) were attack-free and free of long-term prophylaxis at the latest follow-up, for a median of 10.2 months (range, 0.5 to 24.0), with a mean 95% reduction in monthly attack rate from baseline. These are single-arm, open-label data reported in a congress abstract (not a full peer-reviewed manuscript) and are not placebo-controlled. [2]</w:t>
       </w:r>
     </w:p>
     <w:p>
@@ -267,95 +252,17 @@
         <w:spacing w:after="120"/>
       </w:pPr>
       <w:r>
-        <w:t xml:space="preserve">The lonvo-z clinical data span the following studies, with the reported follow-up as of each study’s data-cutoff date:</w:t>
-      </w:r>
-    </w:p>
-    <w:p>
-      <w:pPr>
-        <w:pStyle w:val="ListParagraph"/>
-        <w:numPr>
-          <w:ilvl w:val="0"/>
-          <w:numId w:val="1"/>
-        </w:numPr>
-        <w:spacing w:after="60"/>
-      </w:pPr>
-      <w:r>
-        <w:rPr>
-          <w:b/>
-          <w:bCs/>
-        </w:rPr>
-        <w:t xml:space="preserve">Phase 3 HAELO</w:t>
-      </w:r>
-      <w:r>
-        <w:t xml:space="preserve"> — median follow-up 7.5 months (range, 4.9 to 12.8) as of the 10 February 2026 data cutoff. [1]</w:t>
-      </w:r>
-    </w:p>
-    <w:p>
-      <w:pPr>
-        <w:pStyle w:val="ListParagraph"/>
-        <w:numPr>
-          <w:ilvl w:val="0"/>
-          <w:numId w:val="1"/>
-        </w:numPr>
-        <w:spacing w:after="60"/>
-      </w:pPr>
-      <w:r>
-        <w:rPr>
-          <w:b/>
-          <w:bCs/>
-        </w:rPr>
-        <w:t xml:space="preserve">Phase 2</w:t>
-      </w:r>
-      <w:r>
-        <w:t xml:space="preserve"> — as of the 4 April 2024 data cutoff, median follow-up was 8.2 months (range, 4.4 to 11.8) in the 25-mg group and 5.6 months (range, 2.9 to 11.5) in the 50-mg group. [2]</w:t>
-      </w:r>
-    </w:p>
-    <w:p>
-      <w:pPr>
-        <w:pStyle w:val="ListParagraph"/>
-        <w:numPr>
-          <w:ilvl w:val="0"/>
-          <w:numId w:val="1"/>
-        </w:numPr>
-        <w:spacing w:after="60"/>
-      </w:pPr>
-      <w:r>
-        <w:rPr>
-          <w:b/>
-          <w:bCs/>
-        </w:rPr>
-        <w:t xml:space="preserve">Phase 1</w:t>
-      </w:r>
-      <w:r>
-        <w:t xml:space="preserve"> — as of the 17 February 2023 data cutoff, median follow-up was 13.1 months (25-mg group), 9.3 months (75-mg group), and 5.7 months (50-mg group). Across dose levels, the reductions in total plasma kallikrein levels and in angioedema attacks were durable through the latest assessment. [3]</w:t>
-      </w:r>
-    </w:p>
-    <w:p>
-      <w:pPr>
-        <w:pStyle w:val="ListParagraph"/>
-        <w:numPr>
-          <w:ilvl w:val="0"/>
-          <w:numId w:val="1"/>
-        </w:numPr>
-        <w:spacing w:after="60"/>
-      </w:pPr>
-      <w:r>
-        <w:rPr>
-          <w:b/>
-          <w:bCs/>
-        </w:rPr>
-        <w:t xml:space="preserve">Longer-term 50-mg analysis (congress abstract)</w:t>
-      </w:r>
-      <w:r>
-        <w:t xml:space="preserve"> — in all 28 patients who received lonvo-z 50 mg across the Phase 1/2 program, as of the 12 February 2025 data cutoff, median follow-up after the 50-mg dose was 18.9 months (range, 10.2 to 24.4) in the cohort dosed initially at 50 mg — representing up to approximately 2 years of follow-up, the longest reported to date. This is a single-arm, open-label abstract analysis. [4]</w:t>
-      </w:r>
-    </w:p>
-    <w:p>
-      <w:pPr>
-        <w:spacing w:after="120"/>
-      </w:pPr>
-      <w:r>
-        <w:t xml:space="preserve">The available data therefore extend to approximately two years of follow-up for the earliest-treated 50-mg patients, with shorter follow-up for more recently treated patients; longer-term and ongoing follow-up continue to accrue.</w:t>
+        <w:t xml:space="preserve">The longest available follow-up comes from the open-label analysis of the 28 patients treated with lonvo-z 50 mg: as of the 12 February 2025 data cutoff, the median follow-up after the 50-mg dose was 18.9 months (range, 10.2 to 24.4) in the cohort dosed initially at 50 mg — representing </w:t>
+      </w:r>
+      <w:r>
+        <w:rPr>
+          <w:b/>
+          <w:bCs/>
+        </w:rPr>
+        <w:t xml:space="preserve">up to approximately 2 years</w:t>
+      </w:r>
+      <w:r>
+        <w:t xml:space="preserve">. [2] In the pivotal, placebo-controlled Phase 3 HAELO trial, the median follow-up was 7.5 months (range, 4.9 to 12.8) as of the 10 February 2026 data cutoff. [1] Longer-term and ongoing follow-up continue to accrue.</w:t>
       </w:r>
     </w:p>
     <w:p>
@@ -437,26 +344,10 @@
     </w:p>
     <w:p>
       <w:pPr>
-        <w:spacing w:after="60"/>
-      </w:pPr>
-      <w:r>
-        <w:t xml:space="preserve">2. Cohn DM, Gurugama P, Magerl M, et al. CRISPR-based therapy for hereditary angioedema. N Engl J Med. 2024. DOI: 10.1056/NEJMoa2405734. (NCT05120830.)</w:t>
-      </w:r>
-    </w:p>
-    <w:p>
-      <w:pPr>
-        <w:spacing w:after="60"/>
-      </w:pPr>
-      <w:r>
-        <w:t xml:space="preserve">3. Longhurst HJ, Lindsay K, Petersen RS, et al. CRISPR-Cas9 in vivo gene editing of KLKB1 for hereditary angioedema. N Engl J Med. 2024;390(5):432-441. DOI: 10.1056/NEJMoa2309149. (NCT05120830.)</w:t>
-      </w:r>
-    </w:p>
-    <w:p>
-      <w:pPr>
-        <w:spacing w:after="120"/>
-      </w:pPr>
-      <w:r>
-        <w:t xml:space="preserve">4. Magerl M, Gurugama P, Katelaris C, et al. Long-term durability and safety of lonvoguran ziclumeran (lonvo-z, NTLA-2002) 50 mg in patients with hereditary angioedema. J Allergy Clin Immunol. 2025;157(2):AB21. Abstract 061, AAAAI Annual Meeting 2025. (Congress abstract; open-label, single-arm follow-up.)</w:t>
+        <w:spacing w:after="120"/>
+      </w:pPr>
+      <w:r>
+        <w:t xml:space="preserve">2. Magerl M, Gurugama P, Katelaris C, et al. Long-term durability and safety of lonvoguran ziclumeran (lonvo-z, NTLA-2002) 50 mg in patients with hereditary angioedema. J Allergy Clin Immunol. 2025;157(2):AB21. Abstract 061, AAAAI Annual Meeting 2025. (Congress abstract; open-label, single-arm follow-up.)</w:t>
       </w:r>
     </w:p>
     <w:p>
@@ -579,7 +470,7 @@
         <w:sz w:val="15"/>
         <w:szCs w:val="15"/>
       </w:rPr>
-      <w:t xml:space="preserve">SRL-2026-0001 · 0.2 DRAFT · </w:t>
+      <w:t xml:space="preserve">SRL-2026-0001 · 0.3 DRAFT · </w:t>
     </w:r>
     <w:r>
       <w:rPr>

</xml_diff>